<commit_message>
Actualizacion casos de uso y wireframes
</commit_message>
<xml_diff>
--- a/_docs_/trim02/01_casos_uso/LINKS PROYECTO.docx
+++ b/_docs_/trim02/01_casos_uso/LINKS PROYECTO.docx
@@ -4,22 +4,23 @@
   <w:body>
     <w:p>
       <w:r>
-        <w:t xml:space="preserve">LINK MOCKUPS:   </w:t>
+        <w:t>LINK MOCKUPS</w:t>
       </w:r>
-      <w:hyperlink r:id="rId4" w:history="1">
-        <w:r>
-          <w:rPr>
-            <w:rStyle w:val="Hipervnculo"/>
-          </w:rPr>
-          <w:t>https://canva.link/4k8w9m9kcufb38o</w:t>
-        </w:r>
-      </w:hyperlink>
+      <w:r>
+        <w:t xml:space="preserve">:  </w:t>
+      </w:r>
+      <w:r>
+        <w:t>https://www.figma.com/make/Ajo6JVxPKafUKIQqcowxXW/Crear-wireframes?t=VAT5Ahu2d01HmIVq-</w:t>
+      </w:r>
+      <w:r>
+        <w:t>0</w:t>
+      </w:r>
     </w:p>
     <w:p>
       <w:r>
         <w:t xml:space="preserve">LINK DOCUMENTACION:  </w:t>
       </w:r>
-      <w:hyperlink r:id="rId5" w:history="1">
+      <w:hyperlink r:id="rId4" w:history="1">
         <w:r>
           <w:rPr>
             <w:rStyle w:val="Hipervnculo"/>

</xml_diff>